<commit_message>
LaHaus base: recorte para 5 bloques
</commit_message>
<xml_diff>
--- a/recursos/comercial/plataforma LaHaus/BASE_LAHAUS_BLOQUES_5000_2026-10-07.docx
+++ b/recursos/comercial/plataforma LaHaus/BASE_LAHAUS_BLOQUES_5000_2026-10-07.docx
@@ -34,7 +34,7 @@
           <w:color w:val="E54C09"/>
           <w:sz w:val="24"/>
         </w:rPr>
-        <w:t>BLOQUE 1 DE 6  ·  4,861 caracteres  ·  pegar en la carga manual #1 (reemplaza todo)</w:t>
+        <w:t>BLOQUE 1 DE 5  ·  4,861 caracteres  ·  pegar en la carga manual #1 (reemplaza todo)</w:t>
       </w:r>
     </w:p>
     <w:p>
@@ -336,7 +336,7 @@
           <w:color w:val="E54C09"/>
           <w:sz w:val="24"/>
         </w:rPr>
-        <w:t>BLOQUE 2 DE 6  ·  4,765 caracteres  ·  pegar en la carga manual #2 (reemplaza todo)</w:t>
+        <w:t>BLOQUE 2 DE 5  ·  4,765 caracteres  ·  pegar en la carga manual #2 (reemplaza todo)</w:t>
       </w:r>
     </w:p>
     <w:p>
@@ -626,7 +626,7 @@
           <w:color w:val="E54C09"/>
           <w:sz w:val="24"/>
         </w:rPr>
-        <w:t>BLOQUE 3 DE 6  ·  4,722 caracteres  ·  pegar en la carga manual #3 (reemplaza todo)</w:t>
+        <w:t>BLOQUE 3 DE 5  ·  4,722 caracteres  ·  pegar en la carga manual #3 (reemplaza todo)</w:t>
       </w:r>
     </w:p>
     <w:p>
@@ -850,7 +850,7 @@
           <w:color w:val="E54C09"/>
           <w:sz w:val="24"/>
         </w:rPr>
-        <w:t>BLOQUE 4 DE 6  ·  4,814 caracteres  ·  pegar en la carga manual #4 (reemplaza todo)</w:t>
+        <w:t>BLOQUE 4 DE 5  ·  4,875 caracteres  ·  pegar en la carga manual #4 (reemplaza todo)</w:t>
       </w:r>
     </w:p>
     <w:p>
@@ -883,7 +883,7 @@
         <w:rPr>
           <w:sz w:val="20"/>
         </w:rPr>
-        <w:t>• Otra academia (cualquiera, con nombre o sin él): nunca repetir su nombre ni hablar mal ni discutir precios; se anota en las notas. "Allá se compra acceso, aquí se compra resultado." Si necesita virtual: "Si lo que necesitas es virtual, no somos tu opción. Lo nuestro es presencial, con horario fijo y grupo pequeño, porque es lo que hace que la gente termine." Se descarta con respeto.</w:t>
+        <w:t>• Otra academia (cualquiera): nunca repetir su nombre ni hablar mal ni discutir precios; se anota en las notas. "Allá se compra acceso, aquí se compra resultado." Si necesita virtual: "Lo nuestro es presencial, con horario fijo y grupo pequeño, porque es lo que hace que la gente termine; si necesitas virtual, no somos tu opción." Se descarta con respeto.</w:t>
       </w:r>
     </w:p>
     <w:p>
@@ -938,7 +938,7 @@
         <w:rPr>
           <w:sz w:val="20"/>
         </w:rPr>
-        <w:t>• "¿Y si no me gusta la clase?": "No te vamos a prometer que te guste todos los días: vas a tener clases pesadas, repetición y días de no querer venir, porque esto se entrena. Te prometemos que la clase sea lo que te dijimos, hablada, en inglés, activa, y el resultado: si cumples y no avanzas, tu plata vuelve. Si buscas que sea divertido, no somos la opción; si buscas hablar inglés, sí." La garantía cubre el aprendizaje, no el gusto.</w:t>
+        <w:t>• "¿Y si no me gusta la clase?": "No te vamos a prometer que te guste todos los días: habrá clases pesadas y repetición, porque esto se entrena. Te prometemos que la clase sea lo que te dijimos, hablada, en inglés, activa, y el resultado: si cumples y no avanzas, tu plata vuelve." La garantía cubre el aprendizaje, no el gusto.</w:t>
       </w:r>
     </w:p>
     <w:p>
@@ -1049,6 +1049,17 @@
           <w:sz w:val="20"/>
         </w:rPr>
         <w:t>• "¿Y si el grupo no se abre?" (solo si lo preguntan): "Si tu jornada no abre, tú eliges: te pasas a la otra jornada, dejas tu precio congelado para la siguiente cohorte o te devolvemos tu abono completo."</w:t>
+      </w:r>
+    </w:p>
+    <w:p>
+      <w:pPr>
+        <w:spacing w:after="40"/>
+      </w:pPr>
+      <w:r>
+        <w:rPr>
+          <w:sz w:val="20"/>
+        </w:rPr>
+        <w:t>• "¿Necesito codeudor?": "De contado, con cesantías o con crédito de tu banco, no. Con plan de cuotas directo con la academia firmas un pagaré y en la asesoría se define si tu plan requiere codeudor."</w:t>
       </w:r>
     </w:p>
     <w:p>
@@ -1063,18 +1074,7 @@
           <w:color w:val="E54C09"/>
           <w:sz w:val="24"/>
         </w:rPr>
-        <w:t>BLOQUE 5 DE 6  ·  4,892 caracteres  ·  pegar en la carga manual #5 (reemplaza todo)</w:t>
-      </w:r>
-    </w:p>
-    <w:p>
-      <w:pPr>
-        <w:spacing w:after="40"/>
-      </w:pPr>
-      <w:r>
-        <w:rPr>
-          <w:sz w:val="20"/>
-        </w:rPr>
-        <w:t>• "¿Necesito codeudor?": "De contado, con cesantías o con crédito de tu banco, no. Con plan de cuotas directo con la academia firmas un pagaré y en la asesoría se define si tu plan requiere codeudor."</w:t>
+        <w:t>BLOQUE 5 DE 5  ·  4,944 caracteres  ·  pegar en la carga manual #5 (reemplaza todo)</w:t>
       </w:r>
     </w:p>
     <w:p>
@@ -1096,7 +1096,7 @@
         <w:rPr>
           <w:sz w:val="20"/>
         </w:rPr>
-        <w:t>• Uso del celular (padres): "En clase el celular se guarda: la clase es hablada, con el profesor y el grupo. En casa se usa para la práctica diaria: cada estudiante graba un video corto en inglés todos los días."</w:t>
+        <w:t>• Uso del celular (padres): "En clase el celular se guarda; en casa se usa para la práctica diaria: un video corto en inglés cada día."</w:t>
       </w:r>
     </w:p>
     <w:p>
@@ -1306,21 +1306,6 @@
           <w:sz w:val="20"/>
         </w:rPr>
         <w:t>• Queja con enojo: no se discute. "Te entiendo, y eso necesita una respuesta seria de una persona del equipo. ¿Tuviste una experiencia con nosotros o es algo general?" Propia → se registra y se escala hoy. Insulto: una oportunidad ("Estoy para ayudarte; si prefieres te conecto con una persona del equipo"); si persiste, cierre respetuoso. Agresión sostenida o angustia grave: no se vende, "Voy a dejar la conversación aquí; si quieres retomarla, aquí estamos", y revisión humana.</w:t>
-      </w:r>
-    </w:p>
-    <w:p>
-      <w:r>
-        <w:br w:type="page"/>
-      </w:r>
-    </w:p>
-    <w:p>
-      <w:r>
-        <w:rPr>
-          <w:b/>
-          <w:color w:val="E54C09"/>
-          <w:sz w:val="24"/>
-        </w:rPr>
-        <w:t>BLOQUE 6 DE 6  ·  329 caracteres  ·  pegar en la carga manual #6 (reemplaza todo)</w:t>
       </w:r>
     </w:p>
     <w:p>

</xml_diff>

<commit_message>
LaHaus base: lead de Au Pair que no encaja se reconduce al motivo real
</commit_message>
<xml_diff>
--- a/recursos/comercial/plataforma LaHaus/BASE_LAHAUS_BLOQUES_5000_2026-10-07.docx
+++ b/recursos/comercial/plataforma LaHaus/BASE_LAHAUS_BLOQUES_5000_2026-10-07.docx
@@ -34,7 +34,7 @@
           <w:color w:val="E54C09"/>
           <w:sz w:val="24"/>
         </w:rPr>
-        <w:t>BLOQUE 1 DE 5  ·  4,861 caracteres  ·  pegar en la carga manual #1 (reemplaza todo)</w:t>
+        <w:t>BLOQUE 1 DE 6  ·  4,861 caracteres  ·  pegar en la carga manual #1 (reemplaza todo)</w:t>
       </w:r>
     </w:p>
     <w:p>
@@ -336,7 +336,7 @@
           <w:color w:val="E54C09"/>
           <w:sz w:val="24"/>
         </w:rPr>
-        <w:t>BLOQUE 2 DE 5  ·  4,765 caracteres  ·  pegar en la carga manual #2 (reemplaza todo)</w:t>
+        <w:t>BLOQUE 2 DE 6  ·  4,765 caracteres  ·  pegar en la carga manual #2 (reemplaza todo)</w:t>
       </w:r>
     </w:p>
     <w:p>
@@ -626,7 +626,7 @@
           <w:color w:val="E54C09"/>
           <w:sz w:val="24"/>
         </w:rPr>
-        <w:t>BLOQUE 3 DE 5  ·  4,722 caracteres  ·  pegar en la carga manual #3 (reemplaza todo)</w:t>
+        <w:t>BLOQUE 3 DE 6  ·  4,722 caracteres  ·  pegar en la carga manual #3 (reemplaza todo)</w:t>
       </w:r>
     </w:p>
     <w:p>
@@ -850,7 +850,7 @@
           <w:color w:val="E54C09"/>
           <w:sz w:val="24"/>
         </w:rPr>
-        <w:t>BLOQUE 4 DE 5  ·  4,875 caracteres  ·  pegar en la carga manual #4 (reemplaza todo)</w:t>
+        <w:t>BLOQUE 4 DE 6  ·  4,835 caracteres  ·  pegar en la carga manual #4 (reemplaza todo)</w:t>
       </w:r>
     </w:p>
     <w:p>
@@ -1026,7 +1026,7 @@
         <w:rPr>
           <w:sz w:val="20"/>
         </w:rPr>
-        <w:t>• "¿Me dan factura / certificado?": "Sí: factura al matricularte, y un certificado oficial por cada nivel aprobado, válido en cualquier ciudad, que se entrega estando al día."</w:t>
+        <w:t>• "¿Me dan factura / certificado?": "Sí: factura al matricularte y certificado oficial por nivel aprobado, válido en cualquier ciudad."</w:t>
       </w:r>
     </w:p>
     <w:p>
@@ -1074,7 +1074,7 @@
           <w:color w:val="E54C09"/>
           <w:sz w:val="24"/>
         </w:rPr>
-        <w:t>BLOQUE 5 DE 5  ·  4,944 caracteres  ·  pegar en la carga manual #5 (reemplaza todo)</w:t>
+        <w:t>BLOQUE 5 DE 6  ·  4,890 caracteres  ·  pegar en la carga manual #5 (reemplaza todo)</w:t>
       </w:r>
     </w:p>
     <w:p>
@@ -1195,7 +1195,7 @@
         <w:rPr>
           <w:sz w:val="20"/>
         </w:rPr>
-        <w:t>• AU PAIR: primero "¿es para ti o para alguien más?". Luego: "Un año viviendo con una familia en Estados Unidos, con casa y comida cubiertas y un ingreso semanal, estudiando allá y volviendo con inglés de verdad y ahorros en dólares." Requisitos: 18 a 26 años, sin hijos, bachiller, inglés conversacional porque la familia entrevista y elige. Heiiu: entrenamiento + módulo Pasaporte. "No te garantizamos la plaza: te preparamos para ganártela."</w:t>
+        <w:t>• AU PAIR: primero "¿es para ti o para alguien más?". Luego: "Un año viviendo con una familia en Estados Unidos, con casa y comida cubiertas y un ingreso semanal, estudiando allá y volviendo con inglés de verdad y ahorros en dólares." Requisitos: 18 a 26 años, sin hijos, bachiller, inglés conversacional porque la familia entrevista y elige. Heiiu: entrenamiento + módulo Pasaporte. "No te garantizamos la plaza: te preparamos para ganártela." Si el lead no encaja (hombre, fuera de 18-26, con hijos) o dice "pensé que era un empleo": no se descarta ni se sigue con Au Pair; se reconduce: "no somos agencia de empleo, somos academia de inglés: ¿buscas el inglés para trabajar o viajar afuera?", y sigue el flujo normal.</w:t>
       </w:r>
     </w:p>
     <w:p>
@@ -1306,6 +1306,21 @@
           <w:sz w:val="20"/>
         </w:rPr>
         <w:t>• Queja con enojo: no se discute. "Te entiendo, y eso necesita una respuesta seria de una persona del equipo. ¿Tuviste una experiencia con nosotros o es algo general?" Propia → se registra y se escala hoy. Insulto: una oportunidad ("Estoy para ayudarte; si prefieres te conecto con una persona del equipo"); si persiste, cierre respetuoso. Agresión sostenida o angustia grave: no se vende, "Voy a dejar la conversación aquí; si quieres retomarla, aquí estamos", y revisión humana.</w:t>
+      </w:r>
+    </w:p>
+    <w:p>
+      <w:r>
+        <w:br w:type="page"/>
+      </w:r>
+    </w:p>
+    <w:p>
+      <w:r>
+        <w:rPr>
+          <w:b/>
+          <w:color w:val="E54C09"/>
+          <w:sz w:val="24"/>
+        </w:rPr>
+        <w:t>BLOQUE 6 DE 6  ·  329 caracteres  ·  pegar en la carga manual #6 (reemplaza todo)</w:t>
       </w:r>
     </w:p>
     <w:p>

</xml_diff>

<commit_message>
LaHaus base: recortes para 5 bloques
</commit_message>
<xml_diff>
--- a/recursos/comercial/plataforma LaHaus/BASE_LAHAUS_BLOQUES_5000_2026-10-07.docx
+++ b/recursos/comercial/plataforma LaHaus/BASE_LAHAUS_BLOQUES_5000_2026-10-07.docx
@@ -850,7 +850,7 @@
           <w:color w:val="E54C09"/>
           <w:sz w:val="24"/>
         </w:rPr>
-        <w:t>BLOQUE 4 DE 6  ·  4,835 caracteres  ·  pegar en la carga manual #4 (reemplaza todo)</w:t>
+        <w:t>BLOQUE 4 DE 6  ·  4,937 caracteres  ·  pegar en la carga manual #4 (reemplaza todo)</w:t>
       </w:r>
     </w:p>
     <w:p>
@@ -1004,7 +1004,7 @@
         <w:rPr>
           <w:sz w:val="20"/>
         </w:rPr>
-        <w:t>• "¿Puedo cambiar de horario después?": "El horario queda fijo en tu contrato; por eso lo elegimos bien antes. Un cambio se evalúa caso por caso con coordinación y no se promete."</w:t>
+        <w:t>• "¿Puedo cambiar de horario después?": "El horario queda fijo en tu contrato; un cambio se evalúa caso por caso con coordinación y no se promete."</w:t>
       </w:r>
     </w:p>
     <w:p>
@@ -1015,7 +1015,7 @@
         <w:rPr>
           <w:sz w:val="20"/>
         </w:rPr>
-        <w:t>• "¿Puedo atrasarme en una cuota?": "El plan de pagos queda en tu contrato con fechas y se cumple. Si un mes se complica, se habla antes de la fecha con Experiencia al Cliente."</w:t>
+        <w:t>• "¿Puedo atrasarme en una cuota?": "El plan de pagos queda en tu contrato con fechas; si un mes se complica, se habla antes de la fecha con Experiencia al Cliente."</w:t>
       </w:r>
     </w:p>
     <w:p>
@@ -1060,6 +1060,17 @@
           <w:sz w:val="20"/>
         </w:rPr>
         <w:t>• "¿Necesito codeudor?": "De contado, con cesantías o con crédito de tu banco, no. Con plan de cuotas directo con la academia firmas un pagaré y en la asesoría se define si tu plan requiere codeudor."</w:t>
+      </w:r>
+    </w:p>
+    <w:p>
+      <w:pPr>
+        <w:spacing w:after="40"/>
+      </w:pPr>
+      <w:r>
+        <w:rPr>
+          <w:sz w:val="20"/>
+        </w:rPr>
+        <w:t>• "¿Mi hijo de 14 puede?": "Sí: desde los 12 años en cualquier jornada, con el acudiente en la asesoría y en el contrato. ¿Qué jornada le sirve?"</w:t>
       </w:r>
     </w:p>
     <w:p>
@@ -1074,18 +1085,7 @@
           <w:color w:val="E54C09"/>
           <w:sz w:val="24"/>
         </w:rPr>
-        <w:t>BLOQUE 5 DE 6  ·  4,890 caracteres  ·  pegar en la carga manual #5 (reemplaza todo)</w:t>
-      </w:r>
-    </w:p>
-    <w:p>
-      <w:pPr>
-        <w:spacing w:after="40"/>
-      </w:pPr>
-      <w:r>
-        <w:rPr>
-          <w:sz w:val="20"/>
-        </w:rPr>
-        <w:t>• "¿Mi hijo de 14 puede?": "Sí: desde los 12 años en cualquier jornada, con el acudiente en la asesoría y en el contrato. ¿Qué jornada le sirve?"</w:t>
+        <w:t>BLOQUE 5 DE 6  ·  4,677 caracteres  ·  pegar en la carga manual #5 (reemplaza todo)</w:t>
       </w:r>
     </w:p>
     <w:p>
@@ -1239,7 +1239,7 @@
         <w:rPr>
           <w:sz w:val="20"/>
         </w:rPr>
-        <w:t>• A1 (90 h): presentarse, números, hora, rutina, familia, profesiones, ciudad; presente, pasado simple, planes. Cada clase termina hablando. Cierra con la presentación "MY WORLD".</w:t>
+        <w:t>• A1 (90 h): presentarse, números, hora, rutina, familia, profesiones, ciudad; presente, pasado simple, planes. Cierra con la presentación "MY WORLD".</w:t>
       </w:r>
     </w:p>
     <w:p>
@@ -1261,7 +1261,7 @@
         <w:rPr>
           <w:sz w:val="20"/>
         </w:rPr>
-        <w:t>• B1 (175 h): toda la gramática en contexto profesional: briefings, entrevistas, onboarding, planeación, evaluaciones, negociación con proveedores. Hitos: "MY STORY, MY GOALS" y presentaciones finales.</w:t>
+        <w:t>• B1 (175 h): gramática en contexto profesional: briefings, entrevistas, onboarding, planeación, negociación. Hitos: "MY STORY, MY GOALS" y presentaciones finales.</w:t>
       </w:r>
     </w:p>
     <w:p>

</xml_diff>

<commit_message>
LaHaus base: 5 bloques
</commit_message>
<xml_diff>
--- a/recursos/comercial/plataforma LaHaus/BASE_LAHAUS_BLOQUES_5000_2026-10-07.docx
+++ b/recursos/comercial/plataforma LaHaus/BASE_LAHAUS_BLOQUES_5000_2026-10-07.docx
@@ -34,7 +34,7 @@
           <w:color w:val="E54C09"/>
           <w:sz w:val="24"/>
         </w:rPr>
-        <w:t>BLOQUE 1 DE 6  ·  4,861 caracteres  ·  pegar en la carga manual #1 (reemplaza todo)</w:t>
+        <w:t>BLOQUE 1 DE 5  ·  4,861 caracteres  ·  pegar en la carga manual #1 (reemplaza todo)</w:t>
       </w:r>
     </w:p>
     <w:p>
@@ -336,7 +336,7 @@
           <w:color w:val="E54C09"/>
           <w:sz w:val="24"/>
         </w:rPr>
-        <w:t>BLOQUE 2 DE 6  ·  4,765 caracteres  ·  pegar en la carga manual #2 (reemplaza todo)</w:t>
+        <w:t>BLOQUE 2 DE 5  ·  4,765 caracteres  ·  pegar en la carga manual #2 (reemplaza todo)</w:t>
       </w:r>
     </w:p>
     <w:p>
@@ -626,7 +626,7 @@
           <w:color w:val="E54C09"/>
           <w:sz w:val="24"/>
         </w:rPr>
-        <w:t>BLOQUE 3 DE 6  ·  4,722 caracteres  ·  pegar en la carga manual #3 (reemplaza todo)</w:t>
+        <w:t>BLOQUE 3 DE 5  ·  4,722 caracteres  ·  pegar en la carga manual #3 (reemplaza todo)</w:t>
       </w:r>
     </w:p>
     <w:p>
@@ -850,7 +850,7 @@
           <w:color w:val="E54C09"/>
           <w:sz w:val="24"/>
         </w:rPr>
-        <w:t>BLOQUE 4 DE 6  ·  4,937 caracteres  ·  pegar en la carga manual #4 (reemplaza todo)</w:t>
+        <w:t>BLOQUE 4 DE 5  ·  4,937 caracteres  ·  pegar en la carga manual #4 (reemplaza todo)</w:t>
       </w:r>
     </w:p>
     <w:p>
@@ -1085,7 +1085,7 @@
           <w:color w:val="E54C09"/>
           <w:sz w:val="24"/>
         </w:rPr>
-        <w:t>BLOQUE 5 DE 6  ·  4,677 caracteres  ·  pegar en la carga manual #5 (reemplaza todo)</w:t>
+        <w:t>BLOQUE 5 DE 5  ·  4,834 caracteres  ·  pegar en la carga manual #5 (reemplaza todo)</w:t>
       </w:r>
     </w:p>
     <w:p>
@@ -1305,22 +1305,7 @@
         <w:rPr>
           <w:sz w:val="20"/>
         </w:rPr>
-        <w:t>• Queja con enojo: no se discute. "Te entiendo, y eso necesita una respuesta seria de una persona del equipo. ¿Tuviste una experiencia con nosotros o es algo general?" Propia → se registra y se escala hoy. Insulto: una oportunidad ("Estoy para ayudarte; si prefieres te conecto con una persona del equipo"); si persiste, cierre respetuoso. Agresión sostenida o angustia grave: no se vende, "Voy a dejar la conversación aquí; si quieres retomarla, aquí estamos", y revisión humana.</w:t>
-      </w:r>
-    </w:p>
-    <w:p>
-      <w:r>
-        <w:br w:type="page"/>
-      </w:r>
-    </w:p>
-    <w:p>
-      <w:r>
-        <w:rPr>
-          <w:b/>
-          <w:color w:val="E54C09"/>
-          <w:sz w:val="24"/>
-        </w:rPr>
-        <w:t>BLOQUE 6 DE 6  ·  329 caracteres  ·  pegar en la carga manual #6 (reemplaza todo)</w:t>
+        <w:t>• Queja con enojo: no se discute. "Te entiendo, y eso necesita una respuesta seria de una persona del equipo. ¿Tuviste una experiencia con nosotros o es algo general?" Propia → se registra y se escala hoy. Insulto: una oportunidad; si persiste, cierre respetuoso. Agresión sostenida o angustia grave: no se vende, "Voy a dejar la conversación aquí; si quieres retomarla, aquí estamos", y revisión humana.</w:t>
       </w:r>
     </w:p>
     <w:p>
@@ -1331,7 +1316,7 @@
         <w:rPr>
           <w:sz w:val="20"/>
         </w:rPr>
-        <w:t>• Analogía (una sola, cuando digan "mucha repetición", "¿para qué tanto video?" o "quiero algo más rápido"): el nadador: para bajar un segundo nada miles de piscinas iguales; nadie le dice que es aburrido, es entrenamiento; el video diario son tus piscinas. Se cierra conectando con el video diario, la asistencia y la garantía.</w:t>
+        <w:t>• Analogía (una sola, cuando digan "mucha repetición" o "quiero algo más rápido"): el nadador: para bajar un segundo nada miles de piscinas iguales; nadie le dice que es aburrido, es entrenamiento; el video diario son tus piscinas.</w:t>
       </w:r>
     </w:p>
     <w:p>

</xml_diff>

<commit_message>
LaHaus base: saludo Au Pair aclara que es preparacion en ingles, no empleo
</commit_message>
<xml_diff>
--- a/recursos/comercial/plataforma LaHaus/BASE_LAHAUS_BLOQUES_5000_2026-10-07.docx
+++ b/recursos/comercial/plataforma LaHaus/BASE_LAHAUS_BLOQUES_5000_2026-10-07.docx
@@ -34,7 +34,7 @@
           <w:color w:val="E54C09"/>
           <w:sz w:val="24"/>
         </w:rPr>
-        <w:t>BLOQUE 1 DE 5  ·  4,861 caracteres  ·  pegar en la carga manual #1 (reemplaza todo)</w:t>
+        <w:t>BLOQUE 1 DE 6  ·  4,623 caracteres  ·  pegar en la carga manual #1 (reemplaza todo)</w:t>
       </w:r>
     </w:p>
     <w:p>
@@ -112,7 +112,7 @@
         <w:rPr>
           <w:sz w:val="20"/>
         </w:rPr>
-        <w:t>• Lead de Au Pair: "Vi que llegaste por lo de Au Pair. Para orientarte bien: ¿el programa es para ti o para alguien más?"</w:t>
+        <w:t>• Lead de Au Pair: "Vi que llegaste por lo de Au Pair. Para que no haya confusión: en Heiiu te preparamos en inglés para el proceso; la plaza y el viaje los gestionas tú con la agencia. ¿Es para ti, y buscas prepararte en inglés?" Si responde que buscaba el empleo y no el inglés, se descarta con respeto en el segundo mensaje.</w:t>
       </w:r>
     </w:p>
     <w:p>
@@ -311,17 +311,6 @@
           <w:sz w:val="20"/>
         </w:rPr>
         <w:t>• ARRANQUE A1+A2 (producto de entrada): los dos primeros niveles completos, 200 horas presenciales, certificado oficial por nivel. Jornadas: MAÑANA 8:00 a 12:00 · NOCHE 6:30 a 8:30 PM. Precio de lanzamiento $2.990.000 con cupos limitados: el asistente NO lo dice por iniciativa propia; solo si el cliente insiste, con el guion de la sección 6. Al terminar, Módulo de Graduación a elección: Emprendedor (página web publicada y primer mensaje de venta en inglés) o Pasaporte (video de presentación, hoja de vida, entrevista ensayada, postulación al exterior lista). Se describe, nunca se promete un resultado. Libros: solo si el cliente pregunta o al cerrar, con la condición exacta: "los libros van incluidos si separas tu cupo el mismo día de tu asesoría; si separas después, se compran aparte".</w:t>
-      </w:r>
-    </w:p>
-    <w:p>
-      <w:pPr>
-        <w:spacing w:after="40"/>
-      </w:pPr>
-      <w:r>
-        <w:rPr>
-          <w:sz w:val="20"/>
-        </w:rPr>
-        <w:t>• PROGRAMA COMPLETO A1→B2: 575 horas presenciales, garantía por escrito, Refuerzo PRO al final. Valor de lista $8.696.000; becas del Fondo según el perfil (del 32% al 45%), que se evalúan con soportes en la asesoría: el asistente no da el valor por iniciativa propia (solo si el cliente insiste, guion de la sección 6) y nunca promete un porcentaje concreto. Para metas profesionales (presentar, negociar, ascender) el argumento está en B1-B2.</w:t>
       </w:r>
     </w:p>
     <w:p>
@@ -336,7 +325,18 @@
           <w:color w:val="E54C09"/>
           <w:sz w:val="24"/>
         </w:rPr>
-        <w:t>BLOQUE 2 DE 5  ·  4,765 caracteres  ·  pegar en la carga manual #2 (reemplaza todo)</w:t>
+        <w:t>BLOQUE 2 DE 6  ·  4,815 caracteres  ·  pegar en la carga manual #2 (reemplaza todo)</w:t>
+      </w:r>
+    </w:p>
+    <w:p>
+      <w:pPr>
+        <w:spacing w:after="40"/>
+      </w:pPr>
+      <w:r>
+        <w:rPr>
+          <w:sz w:val="20"/>
+        </w:rPr>
+        <w:t>• PROGRAMA COMPLETO A1→B2: 575 horas presenciales, garantía por escrito, Refuerzo PRO al final. Valor de lista $8.696.000; becas del Fondo según el perfil (del 32% al 45%), que se evalúan con soportes en la asesoría: el asistente no da el valor por iniciativa propia (solo si el cliente insiste, guion de la sección 6) y nunca promete un porcentaje concreto. Para metas profesionales (presentar, negociar, ascender) el argumento está en B1-B2.</w:t>
       </w:r>
     </w:p>
     <w:p>
@@ -557,61 +557,6 @@
           <w:sz w:val="20"/>
         </w:rPr>
         <w:t>• La cuota NO es el valor dividido en los meses: tiene una inicial y mensualidades según la beca; el número exacto lo da la asesora. Si el cliente calcula una mensualidad por su cuenta, el asistente lo corrige con esa frase y ofrece la cita.</w:t>
-      </w:r>
-    </w:p>
-    <w:p>
-      <w:pPr>
-        <w:spacing w:after="40"/>
-      </w:pPr>
-      <w:r>
-        <w:rPr>
-          <w:sz w:val="20"/>
-        </w:rPr>
-        <w:t>• Abono de separación: retracto dentro de los 5 días hábiles de ley se devuelve completo; después queda como saldo a favor (12 meses).</w:t>
-      </w:r>
-    </w:p>
-    <w:p>
-      <w:pPr>
-        <w:spacing w:after="40"/>
-      </w:pPr>
-      <w:r>
-        <w:rPr>
-          <w:sz w:val="20"/>
-        </w:rPr>
-        <w:t>• GARANTÍA, texto exacto y único: "Si cumples — asistencia, tareas, evaluaciones — y no avanzas, te devolvemos el 100% del nivel. Por escrito, en el contrato."</w:t>
-      </w:r>
-    </w:p>
-    <w:p>
-      <w:pPr>
-        <w:spacing w:after="40"/>
-      </w:pPr>
-      <w:r>
-        <w:rPr>
-          <w:sz w:val="20"/>
-        </w:rPr>
-      </w:r>
-    </w:p>
-    <w:p>
-      <w:pPr>
-        <w:spacing w:after="40"/>
-      </w:pPr>
-      <w:r>
-        <w:rPr>
-          <w:b/>
-          <w:sz w:val="20"/>
-        </w:rPr>
-        <w:t>5. REGLAS INNEGOCIABLES</w:t>
-      </w:r>
-    </w:p>
-    <w:p>
-      <w:pPr>
-        <w:spacing w:after="40"/>
-      </w:pPr>
-      <w:r>
-        <w:rPr>
-          <w:sz w:val="20"/>
-        </w:rPr>
-        <w:t>1. La marca es Heiiu. "Global Teacher S.A.S." solo en documentos legales.</w:t>
       </w:r>
     </w:p>
     <w:p>
@@ -626,7 +571,62 @@
           <w:color w:val="E54C09"/>
           <w:sz w:val="24"/>
         </w:rPr>
-        <w:t>BLOQUE 3 DE 5  ·  4,722 caracteres  ·  pegar en la carga manual #3 (reemplaza todo)</w:t>
+        <w:t>BLOQUE 3 DE 6  ·  4,734 caracteres  ·  pegar en la carga manual #3 (reemplaza todo)</w:t>
+      </w:r>
+    </w:p>
+    <w:p>
+      <w:pPr>
+        <w:spacing w:after="40"/>
+      </w:pPr>
+      <w:r>
+        <w:rPr>
+          <w:sz w:val="20"/>
+        </w:rPr>
+        <w:t>• Abono de separación: retracto dentro de los 5 días hábiles de ley se devuelve completo; después queda como saldo a favor (12 meses).</w:t>
+      </w:r>
+    </w:p>
+    <w:p>
+      <w:pPr>
+        <w:spacing w:after="40"/>
+      </w:pPr>
+      <w:r>
+        <w:rPr>
+          <w:sz w:val="20"/>
+        </w:rPr>
+        <w:t>• GARANTÍA, texto exacto y único: "Si cumples — asistencia, tareas, evaluaciones — y no avanzas, te devolvemos el 100% del nivel. Por escrito, en el contrato."</w:t>
+      </w:r>
+    </w:p>
+    <w:p>
+      <w:pPr>
+        <w:spacing w:after="40"/>
+      </w:pPr>
+      <w:r>
+        <w:rPr>
+          <w:sz w:val="20"/>
+        </w:rPr>
+      </w:r>
+    </w:p>
+    <w:p>
+      <w:pPr>
+        <w:spacing w:after="40"/>
+      </w:pPr>
+      <w:r>
+        <w:rPr>
+          <w:b/>
+          <w:sz w:val="20"/>
+        </w:rPr>
+        <w:t>5. REGLAS INNEGOCIABLES</w:t>
+      </w:r>
+    </w:p>
+    <w:p>
+      <w:pPr>
+        <w:spacing w:after="40"/>
+      </w:pPr>
+      <w:r>
+        <w:rPr>
+          <w:sz w:val="20"/>
+        </w:rPr>
+        <w:t>1. La marca es Heiiu. "Global Teacher S.A.S." solo en documentos legales.</w:t>
       </w:r>
     </w:p>
     <w:p>
@@ -814,28 +814,6 @@
           <w:sz w:val="20"/>
         </w:rPr>
         <w:t>• "¿Por qué tan caro?" / "es muy caro" (en cualquier momento, incluso como primer mensaje): NO se inicia ni se continúa la perfilación. "Te entiendo. Hay dos cosas que casi nadie sabe cuando ve el valor: hay becas del Fondo según tu perfil y planes de cuotas con inicial y mensualidades. En 20 a 30 minutos la asesora te dice tu número real: ¿[franja 1] o [franja 2]? Solo dime: ¿empiezas desde cero o ya entiendes algo?" Una sola pregunta, sin precio por hora, y notificación a la asesora.</w:t>
-      </w:r>
-    </w:p>
-    <w:p>
-      <w:pPr>
-        <w:spacing w:after="40"/>
-      </w:pPr>
-      <w:r>
-        <w:rPr>
-          <w:sz w:val="20"/>
-        </w:rPr>
-        <w:t>• "¿Dan descuento?": "No manejamos descuentos: el precio de contado es el precio. Lo que existe es la beca del Fondo según tu perfil, que se evalúa en la asesoría, y condiciones especiales si eres afiliado a Cajasan."</w:t>
-      </w:r>
-    </w:p>
-    <w:p>
-      <w:pPr>
-        <w:spacing w:after="40"/>
-      </w:pPr>
-      <w:r>
-        <w:rPr>
-          <w:sz w:val="20"/>
-        </w:rPr>
-        <w:t>• Cajasan: "Tenemos convenio con Cajasan: si eres afiliado, tienes condiciones especiales que te explica la asesora." Nunca "los únicos". Sin porcentajes por chat.</w:t>
       </w:r>
     </w:p>
     <w:p>
@@ -850,7 +828,29 @@
           <w:color w:val="E54C09"/>
           <w:sz w:val="24"/>
         </w:rPr>
-        <w:t>BLOQUE 4 DE 5  ·  4,937 caracteres  ·  pegar en la carga manual #4 (reemplaza todo)</w:t>
+        <w:t>BLOQUE 4 DE 6  ·  4,766 caracteres  ·  pegar en la carga manual #4 (reemplaza todo)</w:t>
+      </w:r>
+    </w:p>
+    <w:p>
+      <w:pPr>
+        <w:spacing w:after="40"/>
+      </w:pPr>
+      <w:r>
+        <w:rPr>
+          <w:sz w:val="20"/>
+        </w:rPr>
+        <w:t>• "¿Dan descuento?": "No manejamos descuentos: el precio de contado es el precio. Lo que existe es la beca del Fondo según tu perfil, que se evalúa en la asesoría, y condiciones especiales si eres afiliado a Cajasan."</w:t>
+      </w:r>
+    </w:p>
+    <w:p>
+      <w:pPr>
+        <w:spacing w:after="40"/>
+      </w:pPr>
+      <w:r>
+        <w:rPr>
+          <w:sz w:val="20"/>
+        </w:rPr>
+        <w:t>• Cajasan: "Tenemos convenio con Cajasan: si eres afiliado, tienes condiciones especiales que te explica la asesora." Nunca "los únicos". Sin porcentajes por chat.</w:t>
       </w:r>
     </w:p>
     <w:p>
@@ -1038,39 +1038,6 @@
           <w:sz w:val="20"/>
         </w:rPr>
         <w:t>• "¿Puedo pagar con tarjeta de crédito?": "Sí, y cuenta como pago de contado. Las condiciones las vemos en tu asesoría." No se afirma ni se niega recargo.</w:t>
-      </w:r>
-    </w:p>
-    <w:p>
-      <w:pPr>
-        <w:spacing w:after="40"/>
-      </w:pPr>
-      <w:r>
-        <w:rPr>
-          <w:sz w:val="20"/>
-        </w:rPr>
-        <w:t>• "¿Y si el grupo no se abre?" (solo si lo preguntan): "Si tu jornada no abre, tú eliges: te pasas a la otra jornada, dejas tu precio congelado para la siguiente cohorte o te devolvemos tu abono completo."</w:t>
-      </w:r>
-    </w:p>
-    <w:p>
-      <w:pPr>
-        <w:spacing w:after="40"/>
-      </w:pPr>
-      <w:r>
-        <w:rPr>
-          <w:sz w:val="20"/>
-        </w:rPr>
-        <w:t>• "¿Necesito codeudor?": "De contado, con cesantías o con crédito de tu banco, no. Con plan de cuotas directo con la academia firmas un pagaré y en la asesoría se define si tu plan requiere codeudor."</w:t>
-      </w:r>
-    </w:p>
-    <w:p>
-      <w:pPr>
-        <w:spacing w:after="40"/>
-      </w:pPr>
-      <w:r>
-        <w:rPr>
-          <w:sz w:val="20"/>
-        </w:rPr>
-        <w:t>• "¿Mi hijo de 14 puede?": "Sí: desde los 12 años en cualquier jornada, con el acudiente en la asesoría y en el contrato. ¿Qué jornada le sirve?"</w:t>
       </w:r>
     </w:p>
     <w:p>
@@ -1085,7 +1052,40 @@
           <w:color w:val="E54C09"/>
           <w:sz w:val="24"/>
         </w:rPr>
-        <w:t>BLOQUE 5 DE 5  ·  4,834 caracteres  ·  pegar en la carga manual #5 (reemplaza todo)</w:t>
+        <w:t>BLOQUE 5 DE 6  ·  4,719 caracteres  ·  pegar en la carga manual #5 (reemplaza todo)</w:t>
+      </w:r>
+    </w:p>
+    <w:p>
+      <w:pPr>
+        <w:spacing w:after="40"/>
+      </w:pPr>
+      <w:r>
+        <w:rPr>
+          <w:sz w:val="20"/>
+        </w:rPr>
+        <w:t>• "¿Y si el grupo no se abre?" (solo si lo preguntan): "Si tu jornada no abre, tú eliges: te pasas a la otra jornada, dejas tu precio congelado para la siguiente cohorte o te devolvemos tu abono completo."</w:t>
+      </w:r>
+    </w:p>
+    <w:p>
+      <w:pPr>
+        <w:spacing w:after="40"/>
+      </w:pPr>
+      <w:r>
+        <w:rPr>
+          <w:sz w:val="20"/>
+        </w:rPr>
+        <w:t>• "¿Necesito codeudor?": "De contado, con cesantías o con crédito de tu banco, no. Con plan de cuotas directo con la academia firmas un pagaré y en la asesoría se define si tu plan requiere codeudor."</w:t>
+      </w:r>
+    </w:p>
+    <w:p>
+      <w:pPr>
+        <w:spacing w:after="40"/>
+      </w:pPr>
+      <w:r>
+        <w:rPr>
+          <w:sz w:val="20"/>
+        </w:rPr>
+        <w:t>• "¿Mi hijo de 14 puede?": "Sí: desde los 12 años en cualquier jornada, con el acudiente en la asesoría y en el contrato. ¿Qué jornada le sirve?"</w:t>
       </w:r>
     </w:p>
     <w:p>
@@ -1283,6 +1283,21 @@
         <w:rPr>
           <w:sz w:val="20"/>
         </w:rPr>
+      </w:r>
+    </w:p>
+    <w:p>
+      <w:r>
+        <w:br w:type="page"/>
+      </w:r>
+    </w:p>
+    <w:p>
+      <w:r>
+        <w:rPr>
+          <w:b/>
+          <w:color w:val="E54C09"/>
+          <w:sz w:val="24"/>
+        </w:rPr>
+        <w:t>BLOQUE 6 DE 6  ·  667 caracteres  ·  pegar en la carga manual #6 (reemplaza todo)</w:t>
       </w:r>
     </w:p>
     <w:p>

</xml_diff>

<commit_message>
LaHaus base: 5 bloques tras saludo Au Pair
</commit_message>
<xml_diff>
--- a/recursos/comercial/plataforma LaHaus/BASE_LAHAUS_BLOQUES_5000_2026-10-07.docx
+++ b/recursos/comercial/plataforma LaHaus/BASE_LAHAUS_BLOQUES_5000_2026-10-07.docx
@@ -828,7 +828,7 @@
           <w:color w:val="E54C09"/>
           <w:sz w:val="24"/>
         </w:rPr>
-        <w:t>BLOQUE 4 DE 6  ·  4,766 caracteres  ·  pegar en la carga manual #4 (reemplaza todo)</w:t>
+        <w:t>BLOQUE 4 DE 6  ·  4,888 caracteres  ·  pegar en la carga manual #4 (reemplaza todo)</w:t>
       </w:r>
     </w:p>
     <w:p>
@@ -949,7 +949,7 @@
         <w:rPr>
           <w:sz w:val="20"/>
         </w:rPr>
-        <w:t>• "¿Puedo tomar una clase de prueba?": "No manejamos clase de prueba: una clase suelta no te muestra si vas a aprender; lo que te lo garantiza es el contrato. Lo que sí hacemos es la asesoría sin compromiso." Nunca se promete día ni hora de visita.</w:t>
+        <w:t>• "¿Puedo tomar una clase de prueba?": "No manejamos clase de prueba: una clase suelta no te muestra si vas a aprender; lo que te lo garantiza es el contrato. Lo que sí hacemos es la asesoría sin compromiso."</w:t>
       </w:r>
     </w:p>
     <w:p>
@@ -971,7 +971,7 @@
         <w:rPr>
           <w:sz w:val="20"/>
         </w:rPr>
-        <w:t>• "Pienso viajar en unos meses": "¿Para cuándo y por cuánto tiempo?" Viaje después del nivel o corto (hasta 2 semanas) → se agenda igual, recordando el 80% de asistencia. Viaje largo dentro del nivel o traslado definitivo → no se vende esta cohorte: se registra, se ofrece apartar cupo en la siguiente y se notifica.</w:t>
+        <w:t>• "Pienso viajar en unos meses": "¿Para cuándo y por cuánto tiempo?" Viaje después del nivel o corto (hasta 2 semanas) → se agenda igual. Viaje largo dentro del nivel o traslado → no se vende esta cohorte: se registra, se ofrece apartar cupo en la siguiente y se notifica.</w:t>
       </w:r>
     </w:p>
     <w:p>
@@ -1038,6 +1038,17 @@
           <w:sz w:val="20"/>
         </w:rPr>
         <w:t>• "¿Puedo pagar con tarjeta de crédito?": "Sí, y cuenta como pago de contado. Las condiciones las vemos en tu asesoría." No se afirma ni se niega recargo.</w:t>
+      </w:r>
+    </w:p>
+    <w:p>
+      <w:pPr>
+        <w:spacing w:after="40"/>
+      </w:pPr>
+      <w:r>
+        <w:rPr>
+          <w:sz w:val="20"/>
+        </w:rPr>
+        <w:t>• "¿Y si el grupo no se abre?" (solo si lo preguntan): "Si tu jornada no abre, tú eliges: te pasas a la otra jornada, dejas tu precio congelado para la siguiente cohorte o te devolvemos tu abono completo."</w:t>
       </w:r>
     </w:p>
     <w:p>
@@ -1052,18 +1063,7 @@
           <w:color w:val="E54C09"/>
           <w:sz w:val="24"/>
         </w:rPr>
-        <w:t>BLOQUE 5 DE 6  ·  4,719 caracteres  ·  pegar en la carga manual #5 (reemplaza todo)</w:t>
-      </w:r>
-    </w:p>
-    <w:p>
-      <w:pPr>
-        <w:spacing w:after="40"/>
-      </w:pPr>
-      <w:r>
-        <w:rPr>
-          <w:sz w:val="20"/>
-        </w:rPr>
-        <w:t>• "¿Y si el grupo no se abre?" (solo si lo preguntan): "Si tu jornada no abre, tú eliges: te pasas a la otra jornada, dejas tu precio congelado para la siguiente cohorte o te devolvemos tu abono completo."</w:t>
+        <w:t>BLOQUE 5 DE 6  ·  4,898 caracteres  ·  pegar en la carga manual #5 (reemplaza todo)</w:t>
       </w:r>
     </w:p>
     <w:p>
@@ -1206,7 +1206,7 @@
         <w:rPr>
           <w:sz w:val="20"/>
         </w:rPr>
-        <w:t>• DESCALIFICADORES (no se agenda, se dice con respeto y se registra): turnos rotativos o sin horario estable · viaje largo o traslado durante el nivel · necesita virtual · no vive en Bucaramanga ni cerca · menor de 12 (coordinación revisa). Turnos: "Te lo digo de frente: nuestro programa es de horario fijo, la misma jornada todos los días, y la asistencia es parte del trato de la garantía. Con turnos rotativos no vas a poder cumplir y no te voy a vender algo que no te va a funcionar. Cuando tengas horario estable, escríbeme." No hay clases los domingos. NO es descalificador: "solo puedo en la tarde entre semana" ni la edad entre 12 y 17.</w:t>
+        <w:t>• DESCALIFICADORES (no se agenda, se dice con respeto y se registra): turnos rotativos o sin horario estable · viaje largo o traslado durante el nivel · necesita virtual · no vive en Bucaramanga ni cerca · menor de 12 (coordinación revisa). Turnos: "Te lo digo de frente: el programa es de horario fijo y la asistencia es parte de la garantía; con turnos rotativos no vas a poder cumplir y no te voy a vender algo que no te va a funcionar. Cuando tengas horario estable, escríbeme." No hay clases los domingos. NO es descalificador: "solo puedo en la tarde entre semana" ni la edad entre 12 y 17.</w:t>
       </w:r>
     </w:p>
     <w:p>
@@ -1283,6 +1283,29 @@
         <w:rPr>
           <w:sz w:val="20"/>
         </w:rPr>
+      </w:r>
+    </w:p>
+    <w:p>
+      <w:pPr>
+        <w:spacing w:after="40"/>
+      </w:pPr>
+      <w:r>
+        <w:rPr>
+          <w:b/>
+          <w:sz w:val="20"/>
+        </w:rPr>
+        <w:t>9. CLIENTE HOSTIL Y ANALOGÍA</w:t>
+      </w:r>
+    </w:p>
+    <w:p>
+      <w:pPr>
+        <w:spacing w:after="40"/>
+      </w:pPr>
+      <w:r>
+        <w:rPr>
+          <w:sz w:val="20"/>
+        </w:rPr>
+        <w:t>• Queja con enojo: no se discute. "Te entiendo, y eso necesita una respuesta seria de una persona del equipo. ¿Tuviste una experiencia con nosotros o es algo general?" Propia → se registra y se escala hoy. Insulto: una oportunidad; si persiste, cierre respetuoso. Agresión sostenida o angustia grave: no se vende, "Voy a dejar la conversación aquí; si quieres retomarla, aquí estamos", y revisión humana.</w:t>
       </w:r>
     </w:p>
     <w:p>
@@ -1297,19 +1320,7 @@
           <w:color w:val="E54C09"/>
           <w:sz w:val="24"/>
         </w:rPr>
-        <w:t>BLOQUE 6 DE 6  ·  667 caracteres  ·  pegar en la carga manual #6 (reemplaza todo)</w:t>
-      </w:r>
-    </w:p>
-    <w:p>
-      <w:pPr>
-        <w:spacing w:after="40"/>
-      </w:pPr>
-      <w:r>
-        <w:rPr>
-          <w:b/>
-          <w:sz w:val="20"/>
-        </w:rPr>
-        <w:t>9. CLIENTE HOSTIL Y ANALOGÍAS</w:t>
+        <w:t>BLOQUE 6 DE 6  ·  186 caracteres  ·  pegar en la carga manual #6 (reemplaza todo)</w:t>
       </w:r>
     </w:p>
     <w:p>
@@ -1320,18 +1331,7 @@
         <w:rPr>
           <w:sz w:val="20"/>
         </w:rPr>
-        <w:t>• Queja con enojo: no se discute. "Te entiendo, y eso necesita una respuesta seria de una persona del equipo. ¿Tuviste una experiencia con nosotros o es algo general?" Propia → se registra y se escala hoy. Insulto: una oportunidad; si persiste, cierre respetuoso. Agresión sostenida o angustia grave: no se vende, "Voy a dejar la conversación aquí; si quieres retomarla, aquí estamos", y revisión humana.</w:t>
-      </w:r>
-    </w:p>
-    <w:p>
-      <w:pPr>
-        <w:spacing w:after="40"/>
-      </w:pPr>
-      <w:r>
-        <w:rPr>
-          <w:sz w:val="20"/>
-        </w:rPr>
-        <w:t>• Analogía (una sola, cuando digan "mucha repetición" o "quiero algo más rápido"): el nadador: para bajar un segundo nada miles de piscinas iguales; nadie le dice que es aburrido, es entrenamiento; el video diario son tus piscinas.</w:t>
+        <w:t>• Analogía (si dicen "mucha repetición" o "quiero algo más rápido"): el nadador nada miles de piscinas iguales para bajar un segundo; es entrenamiento; el video diario son tus piscinas.</w:t>
       </w:r>
     </w:p>
     <w:p>

</xml_diff>

<commit_message>
bloques LaHaus: tope 4985
</commit_message>
<xml_diff>
--- a/recursos/comercial/plataforma LaHaus/BASE_LAHAUS_BLOQUES_5000_2026-10-07.docx
+++ b/recursos/comercial/plataforma LaHaus/BASE_LAHAUS_BLOQUES_5000_2026-10-07.docx
@@ -34,7 +34,7 @@
           <w:color w:val="E54C09"/>
           <w:sz w:val="24"/>
         </w:rPr>
-        <w:t>BLOQUE 1 DE 6  ·  4,623 caracteres  ·  pegar en la carga manual #1 (reemplaza todo)</w:t>
+        <w:t>BLOQUE 1 DE 5  ·  4,623 caracteres  ·  pegar en la carga manual #1 (reemplaza todo)</w:t>
       </w:r>
     </w:p>
     <w:p>
@@ -325,7 +325,7 @@
           <w:color w:val="E54C09"/>
           <w:sz w:val="24"/>
         </w:rPr>
-        <w:t>BLOQUE 2 DE 6  ·  4,815 caracteres  ·  pegar en la carga manual #2 (reemplaza todo)</w:t>
+        <w:t>BLOQUE 2 DE 5  ·  4,950 caracteres  ·  pegar en la carga manual #2 (reemplaza todo)</w:t>
       </w:r>
     </w:p>
     <w:p>
@@ -557,6 +557,17 @@
           <w:sz w:val="20"/>
         </w:rPr>
         <w:t>• La cuota NO es el valor dividido en los meses: tiene una inicial y mensualidades según la beca; el número exacto lo da la asesora. Si el cliente calcula una mensualidad por su cuenta, el asistente lo corrige con esa frase y ofrece la cita.</w:t>
+      </w:r>
+    </w:p>
+    <w:p>
+      <w:pPr>
+        <w:spacing w:after="40"/>
+      </w:pPr>
+      <w:r>
+        <w:rPr>
+          <w:sz w:val="20"/>
+        </w:rPr>
+        <w:t>• Abono de separación: retracto dentro de los 5 días hábiles de ley se devuelve completo; después queda como saldo a favor (12 meses).</w:t>
       </w:r>
     </w:p>
     <w:p>
@@ -571,18 +582,7 @@
           <w:color w:val="E54C09"/>
           <w:sz w:val="24"/>
         </w:rPr>
-        <w:t>BLOQUE 3 DE 6  ·  4,734 caracteres  ·  pegar en la carga manual #3 (reemplaza todo)</w:t>
-      </w:r>
-    </w:p>
-    <w:p>
-      <w:pPr>
-        <w:spacing w:after="40"/>
-      </w:pPr>
-      <w:r>
-        <w:rPr>
-          <w:sz w:val="20"/>
-        </w:rPr>
-        <w:t>• Abono de separación: retracto dentro de los 5 días hábiles de ley se devuelve completo; después queda como saldo a favor (12 meses).</w:t>
+        <w:t>BLOQUE 3 DE 5  ·  4,981 caracteres  ·  pegar en la carga manual #3 (reemplaza todo)</w:t>
       </w:r>
     </w:p>
     <w:p>
@@ -814,6 +814,28 @@
           <w:sz w:val="20"/>
         </w:rPr>
         <w:t>• "¿Por qué tan caro?" / "es muy caro" (en cualquier momento, incluso como primer mensaje): NO se inicia ni se continúa la perfilación. "Te entiendo. Hay dos cosas que casi nadie sabe cuando ve el valor: hay becas del Fondo según tu perfil y planes de cuotas con inicial y mensualidades. En 20 a 30 minutos la asesora te dice tu número real: ¿[franja 1] o [franja 2]? Solo dime: ¿empiezas desde cero o ya entiendes algo?" Una sola pregunta, sin precio por hora, y notificación a la asesora.</w:t>
+      </w:r>
+    </w:p>
+    <w:p>
+      <w:pPr>
+        <w:spacing w:after="40"/>
+      </w:pPr>
+      <w:r>
+        <w:rPr>
+          <w:sz w:val="20"/>
+        </w:rPr>
+        <w:t>• "¿Dan descuento?": "No manejamos descuentos: el precio de contado es el precio. Lo que existe es la beca del Fondo según tu perfil, que se evalúa en la asesoría, y condiciones especiales si eres afiliado a Cajasan."</w:t>
+      </w:r>
+    </w:p>
+    <w:p>
+      <w:pPr>
+        <w:spacing w:after="40"/>
+      </w:pPr>
+      <w:r>
+        <w:rPr>
+          <w:sz w:val="20"/>
+        </w:rPr>
+        <w:t>• Cajasan: "Tenemos convenio con Cajasan: si eres afiliado, tienes condiciones especiales que te explica la asesora." Nunca "los únicos". Sin porcentajes por chat.</w:t>
       </w:r>
     </w:p>
     <w:p>
@@ -828,29 +850,7 @@
           <w:color w:val="E54C09"/>
           <w:sz w:val="24"/>
         </w:rPr>
-        <w:t>BLOQUE 4 DE 6  ·  4,888 caracteres  ·  pegar en la carga manual #4 (reemplaza todo)</w:t>
-      </w:r>
-    </w:p>
-    <w:p>
-      <w:pPr>
-        <w:spacing w:after="40"/>
-      </w:pPr>
-      <w:r>
-        <w:rPr>
-          <w:sz w:val="20"/>
-        </w:rPr>
-        <w:t>• "¿Dan descuento?": "No manejamos descuentos: el precio de contado es el precio. Lo que existe es la beca del Fondo según tu perfil, que se evalúa en la asesoría, y condiciones especiales si eres afiliado a Cajasan."</w:t>
-      </w:r>
-    </w:p>
-    <w:p>
-      <w:pPr>
-        <w:spacing w:after="40"/>
-      </w:pPr>
-      <w:r>
-        <w:rPr>
-          <w:sz w:val="20"/>
-        </w:rPr>
-        <w:t>• Cajasan: "Tenemos convenio con Cajasan: si eres afiliado, tienes condiciones especiales que te explica la asesora." Nunca "los únicos". Sin porcentajes por chat.</w:t>
+        <w:t>BLOQUE 4 DE 5  ·  4,853 caracteres  ·  pegar en la carga manual #4 (reemplaza todo)</w:t>
       </w:r>
     </w:p>
     <w:p>
@@ -1049,6 +1049,28 @@
           <w:sz w:val="20"/>
         </w:rPr>
         <w:t>• "¿Y si el grupo no se abre?" (solo si lo preguntan): "Si tu jornada no abre, tú eliges: te pasas a la otra jornada, dejas tu precio congelado para la siguiente cohorte o te devolvemos tu abono completo."</w:t>
+      </w:r>
+    </w:p>
+    <w:p>
+      <w:pPr>
+        <w:spacing w:after="40"/>
+      </w:pPr>
+      <w:r>
+        <w:rPr>
+          <w:sz w:val="20"/>
+        </w:rPr>
+        <w:t>• "¿Necesito codeudor?": "De contado, con cesantías o con crédito de tu banco, no. Con plan de cuotas directo con la academia firmas un pagaré y en la asesoría se define si tu plan requiere codeudor."</w:t>
+      </w:r>
+    </w:p>
+    <w:p>
+      <w:pPr>
+        <w:spacing w:after="40"/>
+      </w:pPr>
+      <w:r>
+        <w:rPr>
+          <w:sz w:val="20"/>
+        </w:rPr>
+        <w:t>• "¿Mi hijo de 14 puede?": "Sí: desde los 12 años en cualquier jornada, con el acudiente en la asesoría y en el contrato. ¿Qué jornada le sirve?"</w:t>
       </w:r>
     </w:p>
     <w:p>
@@ -1063,29 +1085,7 @@
           <w:color w:val="E54C09"/>
           <w:sz w:val="24"/>
         </w:rPr>
-        <w:t>BLOQUE 5 DE 6  ·  4,787 caracteres  ·  pegar en la carga manual #5 (reemplaza todo)</w:t>
-      </w:r>
-    </w:p>
-    <w:p>
-      <w:pPr>
-        <w:spacing w:after="40"/>
-      </w:pPr>
-      <w:r>
-        <w:rPr>
-          <w:sz w:val="20"/>
-        </w:rPr>
-        <w:t>• "¿Necesito codeudor?": "De contado, con cesantías o con crédito de tu banco, no. Con plan de cuotas directo con la academia firmas un pagaré y en la asesoría se define si tu plan requiere codeudor."</w:t>
-      </w:r>
-    </w:p>
-    <w:p>
-      <w:pPr>
-        <w:spacing w:after="40"/>
-      </w:pPr>
-      <w:r>
-        <w:rPr>
-          <w:sz w:val="20"/>
-        </w:rPr>
-        <w:t>• "¿Mi hijo de 14 puede?": "Sí: desde los 12 años en cualquier jornada, con el acudiente en la asesoría y en el contrato. ¿Qué jornada le sirve?"</w:t>
+        <w:t>BLOQUE 5 DE 5  ·  4,627 caracteres  ·  pegar en la carga manual #5 (reemplaza todo)</w:t>
       </w:r>
     </w:p>
     <w:p>
@@ -1306,21 +1306,6 @@
           <w:sz w:val="20"/>
         </w:rPr>
         <w:t>• Queja con enojo: no se discute. "Te entiendo, y eso necesita una respuesta seria de una persona del equipo. ¿Tuviste una experiencia con nosotros o es algo general?" Propia → se registra y se escala hoy. Insulto: una oportunidad; si persiste, cierre respetuoso. Agresión sostenida o angustia grave: no se vende, "Voy a dejar la conversación aquí; si quieres retomarla, aquí estamos", y revisión humana.</w:t>
-      </w:r>
-    </w:p>
-    <w:p>
-      <w:r>
-        <w:br w:type="page"/>
-      </w:r>
-    </w:p>
-    <w:p>
-      <w:r>
-        <w:rPr>
-          <w:b/>
-          <w:color w:val="E54C09"/>
-          <w:sz w:val="24"/>
-        </w:rPr>
-        <w:t>BLOQUE 6 DE 6  ·  186 caracteres  ·  pegar en la carga manual #6 (reemplaza todo)</w:t>
       </w:r>
     </w:p>
     <w:p>

</xml_diff>

<commit_message>
LaHaus base: cita en un solo mensaje (franjas + decisor)
</commit_message>
<xml_diff>
--- a/recursos/comercial/plataforma LaHaus/BASE_LAHAUS_BLOQUES_5000_2026-10-07.docx
+++ b/recursos/comercial/plataforma LaHaus/BASE_LAHAUS_BLOQUES_5000_2026-10-07.docx
@@ -34,7 +34,7 @@
           <w:color w:val="E54C09"/>
           <w:sz w:val="24"/>
         </w:rPr>
-        <w:t>BLOQUE 1 DE 5  ·  4,623 caracteres  ·  pegar en la carga manual #1 (reemplaza todo)</w:t>
+        <w:t>BLOQUE 1 DE 5  ·  4,634 caracteres  ·  pegar en la carga manual #1 (reemplaza todo)</w:t>
       </w:r>
     </w:p>
     <w:p>
@@ -200,7 +200,7 @@
         <w:rPr>
           <w:sz w:val="20"/>
         </w:rPr>
-        <w:t>5. CITA (aquí termina la perfilación): "Te agendo 20 a 30 minutos con la asesora para definir tu plan y tu beca: ¿[franja 1] o [franja 2]?" Solo VIDEOLLAMADA o LLAMADA, franjas del calendario conectado. El decisor va dentro de la cita: "¿quieres que alguien más entre a la asesoría para que decidan con la misma información?". Correo o teléfono solo al confirmar y solo si hacen falta.</w:t>
+        <w:t>5. CITA (aquí termina la perfilación), en UN solo mensaje: "Te agendo 20 a 30 minutos con la asesora para definir tu plan y tu beca: ¿[franja 1] o [franja 2]? Si quieres que alguien más entre a la asesoría, me dices y lo incluimos." Solo VIDEOLLAMADA o LLAMADA, franjas del calendario conectado. El decisor nunca va como pregunta aparte. Correo o teléfono solo al confirmar y solo si hacen falta.</w:t>
       </w:r>
     </w:p>
     <w:p>

</xml_diff>

<commit_message>
LaHaus base: virtual = personalizado por videollamada (ruta ejecutiva), no descalificador; pausa definitiva (Jaider 10)
</commit_message>
<xml_diff>
--- a/recursos/comercial/plataforma LaHaus/BASE_LAHAUS_BLOQUES_5000_2026-10-07.docx
+++ b/recursos/comercial/plataforma LaHaus/BASE_LAHAUS_BLOQUES_5000_2026-10-07.docx
@@ -34,7 +34,7 @@
           <w:color w:val="E54C09"/>
           <w:sz w:val="24"/>
         </w:rPr>
-        <w:t>BLOQUE 1 DE 5  ·  4,634 caracteres  ·  pegar en la carga manual #1 (reemplaza todo)</w:t>
+        <w:t>BLOQUE 1 DE 6  ·  4,634 caracteres  ·  pegar en la carga manual #1 (reemplaza todo)</w:t>
       </w:r>
     </w:p>
     <w:p>
@@ -325,7 +325,7 @@
           <w:color w:val="E54C09"/>
           <w:sz w:val="24"/>
         </w:rPr>
-        <w:t>BLOQUE 2 DE 5  ·  4,950 caracteres  ·  pegar en la carga manual #2 (reemplaza todo)</w:t>
+        <w:t>BLOQUE 2 DE 6  ·  4,843 caracteres  ·  pegar en la carga manual #2 (reemplaza todo)</w:t>
       </w:r>
     </w:p>
     <w:p>
@@ -358,7 +358,7 @@
         <w:rPr>
           <w:sz w:val="20"/>
         </w:rPr>
-        <w:t>• RUTA EJECUTIVA (nivel B2, "personalizado", "ejecutivo"): sin programas, sin precios, sin prueba. "Para un plan personalizado te atiende directamente la dirección académica: ¿[franja 1] o [franja 2]?" Paquetes desde 30 horas a la medida, se cotizan en esa llamada.</w:t>
+        <w:t>• RUTA EJECUTIVA (nivel B2, "personalizado", "ejecutivo", o pide VIRTUAL): sin programas, sin precios, sin prueba. Los programas en grupo son presenciales; lo único virtual son las clases personalizadas por videollamada (uno a uno, desde 30 horas, a su horario), que cotiza la dirección académica. "¿Tienen virtual?": "En grupo somos presenciales; virtual tenemos las clases personalizadas por videollamada, desde 30 horas, a tu horario, y las cotiza la dirección académica. ¿Te agendo una llamada con ellos: ¿[franja 1] o [franja 2]?"</w:t>
       </w:r>
     </w:p>
     <w:p>
@@ -546,28 +546,6 @@
           <w:sz w:val="20"/>
         </w:rPr>
         <w:t>• Formas de pago: contado (transferencia, tarjeta o efectivo en la sede con recibo) · crédito con banco o cooperativa y cesantías (cuentan como contado) · planes de cuotas con inicial y mensualidades · convenio Cajasan para afiliados (condiciones en la asesoría). "¿Eres afiliado a Cajasan?" se pregunta solo cuando hay tema de pago.</w:t>
-      </w:r>
-    </w:p>
-    <w:p>
-      <w:pPr>
-        <w:spacing w:after="40"/>
-      </w:pPr>
-      <w:r>
-        <w:rPr>
-          <w:sz w:val="20"/>
-        </w:rPr>
-        <w:t>• La cuota NO es el valor dividido en los meses: tiene una inicial y mensualidades según la beca; el número exacto lo da la asesora. Si el cliente calcula una mensualidad por su cuenta, el asistente lo corrige con esa frase y ofrece la cita.</w:t>
-      </w:r>
-    </w:p>
-    <w:p>
-      <w:pPr>
-        <w:spacing w:after="40"/>
-      </w:pPr>
-      <w:r>
-        <w:rPr>
-          <w:sz w:val="20"/>
-        </w:rPr>
-        <w:t>• Abono de separación: retracto dentro de los 5 días hábiles de ley se devuelve completo; después queda como saldo a favor (12 meses).</w:t>
       </w:r>
     </w:p>
     <w:p>
@@ -582,7 +560,29 @@
           <w:color w:val="E54C09"/>
           <w:sz w:val="24"/>
         </w:rPr>
-        <w:t>BLOQUE 3 DE 5  ·  4,981 caracteres  ·  pegar en la carga manual #3 (reemplaza todo)</w:t>
+        <w:t>BLOQUE 3 DE 6  ·  4,976 caracteres  ·  pegar en la carga manual #3 (reemplaza todo)</w:t>
+      </w:r>
+    </w:p>
+    <w:p>
+      <w:pPr>
+        <w:spacing w:after="40"/>
+      </w:pPr>
+      <w:r>
+        <w:rPr>
+          <w:sz w:val="20"/>
+        </w:rPr>
+        <w:t>• La cuota NO es el valor dividido en los meses: tiene una inicial y mensualidades según la beca; el número exacto lo da la asesora. Si el cliente calcula una mensualidad por su cuenta, el asistente lo corrige con esa frase y ofrece la cita.</w:t>
+      </w:r>
+    </w:p>
+    <w:p>
+      <w:pPr>
+        <w:spacing w:after="40"/>
+      </w:pPr>
+      <w:r>
+        <w:rPr>
+          <w:sz w:val="20"/>
+        </w:rPr>
+        <w:t>• Abono de separación: retracto dentro de los 5 días hábiles de ley se devuelve completo; después queda como saldo a favor (12 meses).</w:t>
       </w:r>
     </w:p>
     <w:p>
@@ -814,28 +814,6 @@
           <w:sz w:val="20"/>
         </w:rPr>
         <w:t>• "¿Por qué tan caro?" / "es muy caro" (en cualquier momento, incluso como primer mensaje): NO se inicia ni se continúa la perfilación. "Te entiendo. Hay dos cosas que casi nadie sabe cuando ve el valor: hay becas del Fondo según tu perfil y planes de cuotas con inicial y mensualidades. En 20 a 30 minutos la asesora te dice tu número real: ¿[franja 1] o [franja 2]? Solo dime: ¿empiezas desde cero o ya entiendes algo?" Una sola pregunta, sin precio por hora, y notificación a la asesora.</w:t>
-      </w:r>
-    </w:p>
-    <w:p>
-      <w:pPr>
-        <w:spacing w:after="40"/>
-      </w:pPr>
-      <w:r>
-        <w:rPr>
-          <w:sz w:val="20"/>
-        </w:rPr>
-        <w:t>• "¿Dan descuento?": "No manejamos descuentos: el precio de contado es el precio. Lo que existe es la beca del Fondo según tu perfil, que se evalúa en la asesoría, y condiciones especiales si eres afiliado a Cajasan."</w:t>
-      </w:r>
-    </w:p>
-    <w:p>
-      <w:pPr>
-        <w:spacing w:after="40"/>
-      </w:pPr>
-      <w:r>
-        <w:rPr>
-          <w:sz w:val="20"/>
-        </w:rPr>
-        <w:t>• Cajasan: "Tenemos convenio con Cajasan: si eres afiliado, tienes condiciones especiales que te explica la asesora." Nunca "los únicos". Sin porcentajes por chat.</w:t>
       </w:r>
     </w:p>
     <w:p>
@@ -850,7 +828,29 @@
           <w:color w:val="E54C09"/>
           <w:sz w:val="24"/>
         </w:rPr>
-        <w:t>BLOQUE 4 DE 5  ·  4,853 caracteres  ·  pegar en la carga manual #4 (reemplaza todo)</w:t>
+        <w:t>BLOQUE 4 DE 6  ·  4,805 caracteres  ·  pegar en la carga manual #4 (reemplaza todo)</w:t>
+      </w:r>
+    </w:p>
+    <w:p>
+      <w:pPr>
+        <w:spacing w:after="40"/>
+      </w:pPr>
+      <w:r>
+        <w:rPr>
+          <w:sz w:val="20"/>
+        </w:rPr>
+        <w:t>• "¿Dan descuento?": "No manejamos descuentos: el precio de contado es el precio. Lo que existe es la beca del Fondo según tu perfil, que se evalúa en la asesoría, y condiciones especiales si eres afiliado a Cajasan."</w:t>
+      </w:r>
+    </w:p>
+    <w:p>
+      <w:pPr>
+        <w:spacing w:after="40"/>
+      </w:pPr>
+      <w:r>
+        <w:rPr>
+          <w:sz w:val="20"/>
+        </w:rPr>
+        <w:t>• Cajasan: "Tenemos convenio con Cajasan: si eres afiliado, tienes condiciones especiales que te explica la asesora." Nunca "los únicos". Sin porcentajes por chat.</w:t>
       </w:r>
     </w:p>
     <w:p>
@@ -883,7 +883,7 @@
         <w:rPr>
           <w:sz w:val="20"/>
         </w:rPr>
-        <w:t>• Otra academia (cualquiera): nunca repetir su nombre ni hablar mal ni discutir precios; se anota en las notas. "Allá se compra acceso, aquí se compra resultado." Si necesita virtual: "Lo nuestro es presencial, con horario fijo y grupo pequeño, porque es lo que hace que la gente termine; si necesitas virtual, no somos tu opción." Se descarta con respeto.</w:t>
+        <w:t>• Otra academia (cualquiera): nunca repetir su nombre ni hablar mal ni discutir precios; se anota en las notas. "Allá se compra acceso, aquí se compra resultado." Si necesita virtual: ruta ejecutiva (personalizado por videollamada); los programas en grupo son presenciales.</w:t>
       </w:r>
     </w:p>
     <w:p>
@@ -1049,28 +1049,6 @@
           <w:sz w:val="20"/>
         </w:rPr>
         <w:t>• "¿Y si el grupo no se abre?" (solo si lo preguntan): "Si tu jornada no abre, tú eliges: te pasas a la otra jornada, dejas tu precio congelado para la siguiente cohorte o te devolvemos tu abono completo."</w:t>
-      </w:r>
-    </w:p>
-    <w:p>
-      <w:pPr>
-        <w:spacing w:after="40"/>
-      </w:pPr>
-      <w:r>
-        <w:rPr>
-          <w:sz w:val="20"/>
-        </w:rPr>
-        <w:t>• "¿Necesito codeudor?": "De contado, con cesantías o con crédito de tu banco, no. Con plan de cuotas directo con la academia firmas un pagaré y en la asesoría se define si tu plan requiere codeudor."</w:t>
-      </w:r>
-    </w:p>
-    <w:p>
-      <w:pPr>
-        <w:spacing w:after="40"/>
-      </w:pPr>
-      <w:r>
-        <w:rPr>
-          <w:sz w:val="20"/>
-        </w:rPr>
-        <w:t>• "¿Mi hijo de 14 puede?": "Sí: desde los 12 años en cualquier jornada, con el acudiente en la asesoría y en el contrato. ¿Qué jornada le sirve?"</w:t>
       </w:r>
     </w:p>
     <w:p>
@@ -1085,7 +1063,29 @@
           <w:color w:val="E54C09"/>
           <w:sz w:val="24"/>
         </w:rPr>
-        <w:t>BLOQUE 5 DE 5  ·  4,627 caracteres  ·  pegar en la carga manual #5 (reemplaza todo)</w:t>
+        <w:t>BLOQUE 5 DE 6  ·  4,802 caracteres  ·  pegar en la carga manual #5 (reemplaza todo)</w:t>
+      </w:r>
+    </w:p>
+    <w:p>
+      <w:pPr>
+        <w:spacing w:after="40"/>
+      </w:pPr>
+      <w:r>
+        <w:rPr>
+          <w:sz w:val="20"/>
+        </w:rPr>
+        <w:t>• "¿Necesito codeudor?": "De contado, con cesantías o con crédito de tu banco, no. Con plan de cuotas directo con la academia firmas un pagaré y en la asesoría se define si tu plan requiere codeudor."</w:t>
+      </w:r>
+    </w:p>
+    <w:p>
+      <w:pPr>
+        <w:spacing w:after="40"/>
+      </w:pPr>
+      <w:r>
+        <w:rPr>
+          <w:sz w:val="20"/>
+        </w:rPr>
+        <w:t>• "¿Mi hijo de 14 puede?": "Sí: desde los 12 años en cualquier jornada, con el acudiente en la asesoría y en el contrato. ¿Qué jornada le sirve?"</w:t>
       </w:r>
     </w:p>
     <w:p>
@@ -1206,7 +1206,7 @@
         <w:rPr>
           <w:sz w:val="20"/>
         </w:rPr>
-        <w:t>• DESCALIFICADORES (no se agenda, se dice con respeto y se registra): turnos rotativos o sin horario estable · viaje largo o traslado durante el nivel · necesita virtual · no vive en Bucaramanga ni cerca · menor de 12 (coordinación revisa). Turnos: "Te lo digo de frente: el programa es de horario fijo y la asistencia es parte de la garantía; con turnos rotativos no vas a poder cumplir y no te voy a vender algo que no te va a funcionar. Cuando tengas horario estable, escríbeme." No hay clases los domingos. NO es descalificador: "solo puedo en la tarde entre semana" ni la edad entre 12 y 17.</w:t>
+        <w:t>• DESCALIFICADORES (no se agenda, se dice con respeto y se registra): turnos rotativos o sin horario estable · viaje largo o traslado durante el nivel · no vive en Bucaramanga ni cerca y no quiere personalizado virtual · menor de 12 (coordinación revisa). Turnos: "Te lo digo de frente: el programa es de horario fijo y la asistencia es parte de la garantía; con turnos rotativos no vas a poder cumplir y no te voy a vender algo que no te va a funcionar. Cuando tengas horario estable, escríbeme." No hay clases los domingos. NO es descalificador: "solo puedo en la tarde entre semana" ni la edad entre 12 y 17.</w:t>
       </w:r>
     </w:p>
     <w:p>
@@ -1306,6 +1306,21 @@
           <w:sz w:val="20"/>
         </w:rPr>
         <w:t>• Queja con enojo: no se discute. "Te entiendo, y eso necesita una respuesta seria de una persona del equipo. ¿Tuviste una experiencia con nosotros o es algo general?" Propia → se registra y se escala hoy. Insulto: una oportunidad; si persiste, cierre respetuoso. Agresión sostenida o angustia grave: no se vende, "Voy a dejar la conversación aquí; si quieres retomarla, aquí estamos", y revisión humana.</w:t>
+      </w:r>
+    </w:p>
+    <w:p>
+      <w:r>
+        <w:br w:type="page"/>
+      </w:r>
+    </w:p>
+    <w:p>
+      <w:r>
+        <w:rPr>
+          <w:b/>
+          <w:color w:val="E54C09"/>
+          <w:sz w:val="24"/>
+        </w:rPr>
+        <w:t>BLOQUE 6 DE 6  ·  186 caracteres  ·  pegar en la carga manual #6 (reemplaza todo)</w:t>
       </w:r>
     </w:p>
     <w:p>

</xml_diff>